<commit_message>
Update Sprint 1 stakeholder management decision record
</commit_message>
<xml_diff>
--- a/documents/team-b/PM/Team40_Sprint1_Stakeholder_Management_and_Decision_Record.docx
+++ b/documents/team-b/PM/Team40_Sprint1_Stakeholder_Management_and_Decision_Record.docx
@@ -8,6 +8,9 @@
         <w:jc w:val="center"/>
       </w:pPr>
       <w:r>
+        <w:rPr>
+          <w:b/>
+        </w:rPr>
         <w:t>Sprint 1 - Stakeholder Management and Decision Record</w:t>
       </w:r>
     </w:p>
@@ -22,7 +25,6 @@
         <w:t>Team 40 / Team B - Intern Management System</w:t>
       </w:r>
     </w:p>
-    <w:p/>
     <w:p>
       <w:pPr>
         <w:pStyle w:val="Heading1"/>
@@ -33,7 +35,10 @@
     </w:p>
     <w:p>
       <w:r>
-        <w:t>This document records the stakeholder feedback, decisions, scope clarifications and follow-up actions that affected Team B during Sprint 1. It is also used as the working record for the stakeholder management task in the team Planner.</w:t>
+        <w:t xml:space="preserve">This document records the stakeholder feedback, decisions, scope clarifications and follow-up actions that </w:t>
+      </w:r>
+      <w:r>
+        <w:t>affected Team B during Sprint 1. It is also used as the working record for the stakeholder management task in the team Planner.</w:t>
       </w:r>
     </w:p>
     <w:p>
@@ -59,469 +64,120 @@
         <w:t>The main stakeholder issue raised during the sprint concerned the connection between Team A's Recruitment Management work and Team B's Intern Task &amp; Progress Management work. The client asked whether the two teams were intentionally creating separate products with a manual onboarding gap between them, or whether this was an oversight.</w:t>
       </w:r>
     </w:p>
-    <w:tbl>
-      <w:tblPr>
-        <w:tblStyle w:val="TableGrid"/>
-        <w:tblW w:w="0" w:type="auto"/>
-        <w:jc w:val="center"/>
-        <w:tblLook w:val="04A0" w:firstRow="1" w:lastRow="0" w:firstColumn="1" w:lastColumn="0" w:noHBand="0" w:noVBand="1"/>
-      </w:tblPr>
-      <w:tblGrid>
-        <w:gridCol w:w="2520"/>
-        <w:gridCol w:w="2520"/>
-        <w:gridCol w:w="2520"/>
-        <w:gridCol w:w="2520"/>
-      </w:tblGrid>
-      <w:tr>
-        <w:trPr>
-          <w:jc w:val="center"/>
-        </w:trPr>
-        <w:tc>
-          <w:tcPr>
-            <w:tcW w:w="2520" w:type="dxa"/>
-            <w:vAlign w:val="center"/>
-          </w:tcPr>
-          <w:p>
-            <w:pPr>
-              <w:spacing w:after="40"/>
-            </w:pPr>
-            <w:r>
-              <w:rPr>
-                <w:b/>
-                <w:sz w:val="18"/>
-              </w:rPr>
-              <w:t>Item</w:t>
-            </w:r>
-          </w:p>
-        </w:tc>
-        <w:tc>
-          <w:tcPr>
-            <w:tcW w:w="2520" w:type="dxa"/>
-            <w:vAlign w:val="center"/>
-          </w:tcPr>
-          <w:p>
-            <w:pPr>
-              <w:spacing w:after="40"/>
-            </w:pPr>
-            <w:r>
-              <w:rPr>
-                <w:b/>
-                <w:sz w:val="18"/>
-              </w:rPr>
-              <w:t>Stakeholder question / feedback</w:t>
-            </w:r>
-          </w:p>
-        </w:tc>
-        <w:tc>
-          <w:tcPr>
-            <w:tcW w:w="2520" w:type="dxa"/>
-            <w:vAlign w:val="center"/>
-          </w:tcPr>
-          <w:p>
-            <w:pPr>
-              <w:spacing w:after="40"/>
-            </w:pPr>
-            <w:r>
-              <w:rPr>
-                <w:b/>
-                <w:sz w:val="18"/>
-              </w:rPr>
-              <w:t>Why it matters</w:t>
-            </w:r>
-          </w:p>
-        </w:tc>
-        <w:tc>
-          <w:tcPr>
-            <w:tcW w:w="2520" w:type="dxa"/>
-            <w:vAlign w:val="center"/>
-          </w:tcPr>
-          <w:p>
-            <w:pPr>
-              <w:spacing w:after="40"/>
-            </w:pPr>
-            <w:r>
-              <w:rPr>
-                <w:b/>
-                <w:sz w:val="18"/>
-              </w:rPr>
-              <w:t>Current status</w:t>
-            </w:r>
-          </w:p>
-        </w:tc>
-      </w:tr>
-      <w:tr>
-        <w:trPr>
-          <w:jc w:val="center"/>
-        </w:trPr>
-        <w:tc>
-          <w:tcPr>
-            <w:tcW w:w="2520" w:type="dxa"/>
-          </w:tcPr>
-          <w:p>
-            <w:pPr>
-              <w:spacing w:after="40"/>
-            </w:pPr>
-            <w:r>
-              <w:rPr>
-                <w:sz w:val="18"/>
-              </w:rPr>
-              <w:t>Onboarding / integration</w:t>
-            </w:r>
-          </w:p>
-        </w:tc>
-        <w:tc>
-          <w:tcPr>
-            <w:tcW w:w="2520" w:type="dxa"/>
-          </w:tcPr>
-          <w:p>
-            <w:pPr>
-              <w:spacing w:after="40"/>
-            </w:pPr>
-            <w:r>
-              <w:rPr>
-                <w:sz w:val="18"/>
-              </w:rPr>
-              <w:t>How will the recruitment workflow connect to Intern Task &amp; Progress Management without leaving a manual gap?</w:t>
-            </w:r>
-          </w:p>
-        </w:tc>
-        <w:tc>
-          <w:tcPr>
-            <w:tcW w:w="2520" w:type="dxa"/>
-          </w:tcPr>
-          <w:p>
-            <w:pPr>
-              <w:spacing w:after="40"/>
-            </w:pPr>
-            <w:r>
-              <w:rPr>
-                <w:sz w:val="18"/>
-              </w:rPr>
-              <w:t>A gap could make the final system feel like two disconnected products.</w:t>
-            </w:r>
-          </w:p>
-        </w:tc>
-        <w:tc>
-          <w:tcPr>
-            <w:tcW w:w="2520" w:type="dxa"/>
-          </w:tcPr>
-          <w:p>
-            <w:pPr>
-              <w:spacing w:after="40"/>
-            </w:pPr>
-            <w:r>
-              <w:rPr>
-                <w:sz w:val="18"/>
-              </w:rPr>
-              <w:t>Resolution proposed and positively received by the client.</w:t>
-            </w:r>
-          </w:p>
-        </w:tc>
-      </w:tr>
-      <w:tr>
-        <w:trPr>
-          <w:jc w:val="center"/>
-        </w:trPr>
-        <w:tc>
-          <w:tcPr>
-            <w:tcW w:w="2520" w:type="dxa"/>
-          </w:tcPr>
-          <w:p>
-            <w:pPr>
-              <w:spacing w:after="40"/>
-            </w:pPr>
-            <w:r>
-              <w:rPr>
-                <w:sz w:val="18"/>
-              </w:rPr>
-              <w:t>Weekly progress structure</w:t>
-            </w:r>
-          </w:p>
-        </w:tc>
-        <w:tc>
-          <w:tcPr>
-            <w:tcW w:w="2520" w:type="dxa"/>
-          </w:tcPr>
-          <w:p>
-            <w:pPr>
-              <w:spacing w:after="40"/>
-            </w:pPr>
-            <w:r>
-              <w:rPr>
-                <w:sz w:val="18"/>
-              </w:rPr>
-              <w:t>Should an Intern submit one overall weekly report or report separately against each assigned task?</w:t>
-            </w:r>
-          </w:p>
-        </w:tc>
-        <w:tc>
-          <w:tcPr>
-            <w:tcW w:w="2520" w:type="dxa"/>
-          </w:tcPr>
-          <w:p>
-            <w:pPr>
-              <w:spacing w:after="40"/>
-            </w:pPr>
-            <w:r>
-              <w:rPr>
-                <w:sz w:val="18"/>
-              </w:rPr>
-              <w:t>Changes the progress workflow and the way progress records are structured.</w:t>
-            </w:r>
-          </w:p>
-        </w:tc>
-        <w:tc>
-          <w:tcPr>
-            <w:tcW w:w="2520" w:type="dxa"/>
-          </w:tcPr>
-          <w:p>
-            <w:pPr>
-              <w:spacing w:after="40"/>
-            </w:pPr>
-            <w:r>
-              <w:rPr>
-                <w:sz w:val="18"/>
-              </w:rPr>
-              <w:t>Pending clarification; working assumption required.</w:t>
-            </w:r>
-          </w:p>
-        </w:tc>
-      </w:tr>
-      <w:tr>
-        <w:trPr>
-          <w:jc w:val="center"/>
-        </w:trPr>
-        <w:tc>
-          <w:tcPr>
-            <w:tcW w:w="2520" w:type="dxa"/>
-          </w:tcPr>
-          <w:p>
-            <w:pPr>
-              <w:spacing w:after="40"/>
-            </w:pPr>
-            <w:r>
-              <w:rPr>
-                <w:sz w:val="18"/>
-              </w:rPr>
-              <w:t>Weekly progress content</w:t>
-            </w:r>
-          </w:p>
-        </w:tc>
-        <w:tc>
-          <w:tcPr>
-            <w:tcW w:w="2520" w:type="dxa"/>
-          </w:tcPr>
-          <w:p>
-            <w:pPr>
-              <w:spacing w:after="40"/>
-            </w:pPr>
-            <w:r>
-              <w:rPr>
-                <w:sz w:val="18"/>
-              </w:rPr>
-              <w:t>Are accomplishments, blockers and next steps sufficient as the minimum weekly progress information?</w:t>
-            </w:r>
-          </w:p>
-        </w:tc>
-        <w:tc>
-          <w:tcPr>
-            <w:tcW w:w="2520" w:type="dxa"/>
-          </w:tcPr>
-          <w:p>
-            <w:pPr>
-              <w:spacing w:after="40"/>
-            </w:pPr>
-            <w:r>
-              <w:rPr>
-                <w:sz w:val="18"/>
-              </w:rPr>
-              <w:t>Defines the minimum fields needed in the progress submission.</w:t>
-            </w:r>
-          </w:p>
-        </w:tc>
-        <w:tc>
-          <w:tcPr>
-            <w:tcW w:w="2520" w:type="dxa"/>
-          </w:tcPr>
-          <w:p>
-            <w:pPr>
-              <w:spacing w:after="40"/>
-            </w:pPr>
-            <w:r>
-              <w:rPr>
-                <w:sz w:val="18"/>
-              </w:rPr>
-              <w:t>Pending clarification; working assumption required.</w:t>
-            </w:r>
-          </w:p>
-        </w:tc>
-      </w:tr>
-      <w:tr>
-        <w:trPr>
-          <w:jc w:val="center"/>
-        </w:trPr>
-        <w:tc>
-          <w:tcPr>
-            <w:tcW w:w="2520" w:type="dxa"/>
-          </w:tcPr>
-          <w:p>
-            <w:pPr>
-              <w:spacing w:after="40"/>
-            </w:pPr>
-            <w:r>
-              <w:rPr>
-                <w:sz w:val="18"/>
-              </w:rPr>
-              <w:t>Task status</w:t>
-            </w:r>
-          </w:p>
-        </w:tc>
-        <w:tc>
-          <w:tcPr>
-            <w:tcW w:w="2520" w:type="dxa"/>
-          </w:tcPr>
-          <w:p>
-            <w:pPr>
-              <w:spacing w:after="40"/>
-            </w:pPr>
-            <w:r>
-              <w:rPr>
-                <w:sz w:val="18"/>
-              </w:rPr>
-              <w:t>Are Assigned, In Progress and Completed sufficient, and should the Intern update the status?</w:t>
-            </w:r>
-          </w:p>
-        </w:tc>
-        <w:tc>
-          <w:tcPr>
-            <w:tcW w:w="2520" w:type="dxa"/>
-          </w:tcPr>
-          <w:p>
-            <w:pPr>
-              <w:spacing w:after="40"/>
-            </w:pPr>
-            <w:r>
-              <w:rPr>
-                <w:sz w:val="18"/>
-              </w:rPr>
-              <w:t>Affects task ownership and interaction behaviour.</w:t>
-            </w:r>
-          </w:p>
-        </w:tc>
-        <w:tc>
-          <w:tcPr>
-            <w:tcW w:w="2520" w:type="dxa"/>
-          </w:tcPr>
-          <w:p>
-            <w:pPr>
-              <w:spacing w:after="40"/>
-            </w:pPr>
-            <w:r>
-              <w:rPr>
-                <w:sz w:val="18"/>
-              </w:rPr>
-              <w:t>Pending clarification; working assumption required.</w:t>
-            </w:r>
-          </w:p>
-        </w:tc>
-      </w:tr>
-      <w:tr>
-        <w:trPr>
-          <w:jc w:val="center"/>
-        </w:trPr>
-        <w:tc>
-          <w:tcPr>
-            <w:tcW w:w="2520" w:type="dxa"/>
-          </w:tcPr>
-          <w:p>
-            <w:pPr>
-              <w:spacing w:after="40"/>
-            </w:pPr>
-            <w:r>
-              <w:rPr>
-                <w:sz w:val="18"/>
-              </w:rPr>
-              <w:t>Task assignment</w:t>
-            </w:r>
-          </w:p>
-        </w:tc>
-        <w:tc>
-          <w:tcPr>
-            <w:tcW w:w="2520" w:type="dxa"/>
-          </w:tcPr>
-          <w:p>
-            <w:pPr>
-              <w:spacing w:after="40"/>
-            </w:pPr>
-            <w:r>
-              <w:rPr>
-                <w:sz w:val="18"/>
-              </w:rPr>
-              <w:t>Are title, description, due date, assigned Intern and status sufficient when a Mentor assigns a task?</w:t>
-            </w:r>
-          </w:p>
-        </w:tc>
-        <w:tc>
-          <w:tcPr>
-            <w:tcW w:w="2520" w:type="dxa"/>
-          </w:tcPr>
-          <w:p>
-            <w:pPr>
-              <w:spacing w:after="40"/>
-            </w:pPr>
-            <w:r>
-              <w:rPr>
-                <w:sz w:val="18"/>
-              </w:rPr>
-              <w:t>Defines the minimum task information needed for the Core MVP.</w:t>
-            </w:r>
-          </w:p>
-        </w:tc>
-        <w:tc>
-          <w:tcPr>
-            <w:tcW w:w="2520" w:type="dxa"/>
-          </w:tcPr>
-          <w:p>
-            <w:pPr>
-              <w:spacing w:after="40"/>
-            </w:pPr>
-            <w:r>
-              <w:rPr>
-                <w:sz w:val="18"/>
-              </w:rPr>
-              <w:t>Pending clarification; working assumption required.</w:t>
-            </w:r>
-          </w:p>
-        </w:tc>
-      </w:tr>
-    </w:tbl>
     <w:p>
       <w:pPr>
-        <w:pStyle w:val="Heading1"/>
+        <w:pStyle w:val="Heading2"/>
       </w:pPr>
       <w:r>
-        <w:lastRenderedPageBreak/>
-        <w:t>3. Onboarding and Integration Resolution</w:t>
+        <w:t>Onboarding / integration</w:t>
       </w:r>
     </w:p>
     <w:p>
       <w:r>
-        <w:t>Team A and Team B discussed the client's concern and agreed that the final delivery should operate as one shared Intern Management System rather than two unrelated standalone products. The teams are working within a shared development project and will connect the relevant data and workflows for the final delivery.</w:t>
+        <w:t>Stakeholder question / feedback: How will the recruitment workflow connect to Intern Task &amp; Progress Management without leaving a manual gap?</w:t>
       </w:r>
     </w:p>
     <w:p>
       <w:r>
-        <w:t>To close the workflow gap without adding a full onboarding module, the proposed solution is a minimal Applicant-to-Intern transition. After Team A completes the recruitment process and an applicant is accepted, that person can transition to an active Intern in the shared system. Team B's Intern Task &amp; Progress Management workflow can then continue from that point.</w:t>
+        <w:t>Why it matters: A gap could make the final system feel like two disconnected products.</w:t>
       </w:r>
     </w:p>
     <w:p>
       <w:r>
-        <w:t>The transition is intentionally limited. It is not intended to introduce orientation, training, document management, onboarding checklists or other broader onboarding functions. This keeps the connection between the two workflows clear without expanding the committed Core MVP into a separate onboarding feature set.</w:t>
+        <w:t>Current status: Resolution proposed and positively received by the client.</w:t>
       </w:r>
     </w:p>
     <w:p>
-      <w:r>
-        <w:t>The client responded positively to the proposed approach and stated that the suggested solutions looked good from their perspective. Additional systems and infrastructure input was invited, so the team will still review any further technical feedback if it is provided.</w:t>
+      <w:pPr>
+        <w:pStyle w:val="Heading2"/>
+      </w:pPr>
+      <w:r>
+        <w:t>Weekly progress structure</w:t>
+      </w:r>
+    </w:p>
+    <w:p>
+      <w:r>
+        <w:t>Stakeholder question / feedback: Should an Intern submit one overall weekly report or report separately against each assigned task?</w:t>
+      </w:r>
+    </w:p>
+    <w:p>
+      <w:r>
+        <w:t>Why it matters: Changes the progress workflow and the way progress records are structured.</w:t>
+      </w:r>
+    </w:p>
+    <w:p>
+      <w:r>
+        <w:t>Current status: Pending clarification; working assumption required.</w:t>
+      </w:r>
+    </w:p>
+    <w:p>
+      <w:pPr>
+        <w:pStyle w:val="Heading2"/>
+      </w:pPr>
+      <w:r>
+        <w:t>Weekly progress content</w:t>
+      </w:r>
+    </w:p>
+    <w:p>
+      <w:r>
+        <w:t>Stakeholder question / feedback: Are accomplishments, blockers and next steps sufficient as the minimum weekly progress information?</w:t>
+      </w:r>
+    </w:p>
+    <w:p>
+      <w:r>
+        <w:t>Why it matters: Defines the minimum fields needed in the progress submission.</w:t>
+      </w:r>
+    </w:p>
+    <w:p>
+      <w:r>
+        <w:lastRenderedPageBreak/>
+        <w:t>Current status: Pending clarification; working assumption required.</w:t>
+      </w:r>
+    </w:p>
+    <w:p>
+      <w:pPr>
+        <w:pStyle w:val="Heading2"/>
+      </w:pPr>
+      <w:r>
+        <w:t>Task status</w:t>
+      </w:r>
+    </w:p>
+    <w:p>
+      <w:r>
+        <w:t>Stakeholder question / feedback: Are Assigned, In Progress and Completed sufficient, and should the Intern update the status?</w:t>
+      </w:r>
+    </w:p>
+    <w:p>
+      <w:r>
+        <w:t>Why it matters: Affects task ownership and interaction behaviour.</w:t>
+      </w:r>
+    </w:p>
+    <w:p>
+      <w:r>
+        <w:t>Current status: Pending clarification; working assumption required.</w:t>
+      </w:r>
+    </w:p>
+    <w:p>
+      <w:pPr>
+        <w:pStyle w:val="Heading2"/>
+      </w:pPr>
+      <w:r>
+        <w:t>Task assignment</w:t>
+      </w:r>
+    </w:p>
+    <w:p>
+      <w:r>
+        <w:t>Stakeholder question / feedback: Are title, description, due date, assigned Intern and status sufficient when a Mentor assigns a task?</w:t>
+      </w:r>
+    </w:p>
+    <w:p>
+      <w:r>
+        <w:t>Why it matters: Defines the minimum task information needed for the Core MVP.</w:t>
+      </w:r>
+    </w:p>
+    <w:p>
+      <w:r>
+        <w:t>Current status: Pending clarification; working assumption required.</w:t>
       </w:r>
     </w:p>
     <w:p>
@@ -529,1942 +185,611 @@
         <w:pStyle w:val="Heading1"/>
       </w:pPr>
       <w:r>
-        <w:t>4. Team A / Team B Impact Review</w:t>
+        <w:t>3. Onboarding and Integration Resolution</w:t>
       </w:r>
     </w:p>
-    <w:tbl>
-      <w:tblPr>
-        <w:tblStyle w:val="TableGrid"/>
-        <w:tblW w:w="0" w:type="auto"/>
-        <w:jc w:val="center"/>
-        <w:tblLook w:val="04A0" w:firstRow="1" w:lastRow="0" w:firstColumn="1" w:lastColumn="0" w:noHBand="0" w:noVBand="1"/>
-      </w:tblPr>
-      <w:tblGrid>
-        <w:gridCol w:w="3360"/>
-        <w:gridCol w:w="3360"/>
-        <w:gridCol w:w="3360"/>
-      </w:tblGrid>
-      <w:tr>
-        <w:trPr>
-          <w:jc w:val="center"/>
-        </w:trPr>
-        <w:tc>
-          <w:tcPr>
-            <w:tcW w:w="3360" w:type="dxa"/>
-          </w:tcPr>
-          <w:p>
-            <w:pPr>
-              <w:spacing w:after="40"/>
-            </w:pPr>
-            <w:r>
-              <w:rPr>
-                <w:b/>
-                <w:sz w:val="18"/>
-              </w:rPr>
-              <w:t>Area</w:t>
-            </w:r>
-          </w:p>
-        </w:tc>
-        <w:tc>
-          <w:tcPr>
-            <w:tcW w:w="3360" w:type="dxa"/>
-          </w:tcPr>
-          <w:p>
-            <w:pPr>
-              <w:spacing w:after="40"/>
-            </w:pPr>
-            <w:r>
-              <w:rPr>
-                <w:b/>
-                <w:sz w:val="18"/>
-              </w:rPr>
-              <w:t>Agreed responsibility / impact</w:t>
-            </w:r>
-          </w:p>
-        </w:tc>
-        <w:tc>
-          <w:tcPr>
-            <w:tcW w:w="3360" w:type="dxa"/>
-          </w:tcPr>
-          <w:p>
-            <w:pPr>
-              <w:spacing w:after="40"/>
-            </w:pPr>
-            <w:r>
-              <w:rPr>
-                <w:b/>
-                <w:sz w:val="18"/>
-              </w:rPr>
-              <w:t>Project implication</w:t>
-            </w:r>
-          </w:p>
-        </w:tc>
-      </w:tr>
-      <w:tr>
-        <w:trPr>
-          <w:jc w:val="center"/>
-        </w:trPr>
-        <w:tc>
-          <w:tcPr>
-            <w:tcW w:w="3360" w:type="dxa"/>
-          </w:tcPr>
-          <w:p>
-            <w:pPr>
-              <w:spacing w:after="40"/>
-            </w:pPr>
-            <w:r>
-              <w:rPr>
-                <w:sz w:val="18"/>
-              </w:rPr>
-              <w:t>Team A</w:t>
-            </w:r>
-          </w:p>
-        </w:tc>
-        <w:tc>
-          <w:tcPr>
-            <w:tcW w:w="3360" w:type="dxa"/>
-          </w:tcPr>
-          <w:p>
-            <w:pPr>
-              <w:spacing w:after="40"/>
-            </w:pPr>
-            <w:r>
-              <w:rPr>
-                <w:sz w:val="18"/>
-              </w:rPr>
-              <w:t>Recruitment Management up to the point where an applicant is accepted.</w:t>
-            </w:r>
-          </w:p>
-        </w:tc>
-        <w:tc>
-          <w:tcPr>
-            <w:tcW w:w="3360" w:type="dxa"/>
-          </w:tcPr>
-          <w:p>
-            <w:pPr>
-              <w:spacing w:after="40"/>
-            </w:pPr>
-            <w:r>
-              <w:rPr>
-                <w:sz w:val="18"/>
-              </w:rPr>
-              <w:t>Provides the accepted applicant who can transition into the Intern workflow.</w:t>
-            </w:r>
-          </w:p>
-        </w:tc>
-      </w:tr>
-      <w:tr>
-        <w:trPr>
-          <w:jc w:val="center"/>
-        </w:trPr>
-        <w:tc>
-          <w:tcPr>
-            <w:tcW w:w="3360" w:type="dxa"/>
-          </w:tcPr>
-          <w:p>
-            <w:pPr>
-              <w:spacing w:after="40"/>
-            </w:pPr>
-            <w:r>
-              <w:rPr>
-                <w:sz w:val="18"/>
-              </w:rPr>
-              <w:t>Shared transition</w:t>
-            </w:r>
-          </w:p>
-        </w:tc>
-        <w:tc>
-          <w:tcPr>
-            <w:tcW w:w="3360" w:type="dxa"/>
-          </w:tcPr>
-          <w:p>
-            <w:pPr>
-              <w:spacing w:after="40"/>
-            </w:pPr>
-            <w:r>
-              <w:rPr>
-                <w:sz w:val="18"/>
-              </w:rPr>
-              <w:t>Minimal Applicant-to-Intern transition inside the shared system.</w:t>
-            </w:r>
-          </w:p>
-        </w:tc>
-        <w:tc>
-          <w:tcPr>
-            <w:tcW w:w="3360" w:type="dxa"/>
-          </w:tcPr>
-          <w:p>
-            <w:pPr>
-              <w:spacing w:after="40"/>
-            </w:pPr>
-            <w:r>
-              <w:rPr>
-                <w:sz w:val="18"/>
-              </w:rPr>
-              <w:t>Connects the two Core MVP workflows without introducing a full onboarding module.</w:t>
-            </w:r>
-          </w:p>
-        </w:tc>
-      </w:tr>
-      <w:tr>
-        <w:trPr>
-          <w:jc w:val="center"/>
-        </w:trPr>
-        <w:tc>
-          <w:tcPr>
-            <w:tcW w:w="3360" w:type="dxa"/>
-          </w:tcPr>
-          <w:p>
-            <w:pPr>
-              <w:spacing w:after="40"/>
-            </w:pPr>
-            <w:r>
-              <w:rPr>
-                <w:sz w:val="18"/>
-              </w:rPr>
-              <w:t>Team B</w:t>
-            </w:r>
-          </w:p>
-        </w:tc>
-        <w:tc>
-          <w:tcPr>
-            <w:tcW w:w="3360" w:type="dxa"/>
-          </w:tcPr>
-          <w:p>
-            <w:pPr>
-              <w:spacing w:after="40"/>
-            </w:pPr>
-            <w:r>
-              <w:rPr>
-                <w:sz w:val="18"/>
-              </w:rPr>
-              <w:t>Intern Task &amp; Progress Management after the person becomes an Intern.</w:t>
-            </w:r>
-          </w:p>
-        </w:tc>
-        <w:tc>
-          <w:tcPr>
-            <w:tcW w:w="3360" w:type="dxa"/>
-          </w:tcPr>
-          <w:p>
-            <w:pPr>
-              <w:spacing w:after="40"/>
-            </w:pPr>
-            <w:r>
-              <w:rPr>
-                <w:sz w:val="18"/>
-              </w:rPr>
-              <w:t>Covers task assignment, task viewing, weekly progress submission and Mentor progress review.</w:t>
-            </w:r>
-          </w:p>
-        </w:tc>
-      </w:tr>
-      <w:tr>
-        <w:trPr>
-          <w:jc w:val="center"/>
-        </w:trPr>
-        <w:tc>
-          <w:tcPr>
-            <w:tcW w:w="3360" w:type="dxa"/>
-          </w:tcPr>
-          <w:p>
-            <w:pPr>
-              <w:spacing w:after="40"/>
-            </w:pPr>
-            <w:r>
-              <w:rPr>
-                <w:sz w:val="18"/>
-              </w:rPr>
-              <w:t>Cross-team coordination</w:t>
-            </w:r>
-          </w:p>
-        </w:tc>
-        <w:tc>
-          <w:tcPr>
-            <w:tcW w:w="3360" w:type="dxa"/>
-          </w:tcPr>
-          <w:p>
-            <w:pPr>
-              <w:spacing w:after="40"/>
-            </w:pPr>
-            <w:r>
-              <w:rPr>
-                <w:sz w:val="18"/>
-              </w:rPr>
-              <w:t>Keep the transition and shared workflow consistent across requirements and design.</w:t>
-            </w:r>
-          </w:p>
-        </w:tc>
-        <w:tc>
-          <w:tcPr>
-            <w:tcW w:w="3360" w:type="dxa"/>
-          </w:tcPr>
-          <w:p>
-            <w:pPr>
-              <w:spacing w:after="40"/>
-            </w:pPr>
-            <w:r>
-              <w:rPr>
-                <w:sz w:val="18"/>
-              </w:rPr>
-              <w:t>BA, UX and PM updates must not create conflicting assumptions between the two teams.</w:t>
-            </w:r>
-          </w:p>
-        </w:tc>
-      </w:tr>
-    </w:tbl>
+    <w:p>
+      <w:r>
+        <w:t xml:space="preserve">Team A and Team B discussed the client's concern and agreed that the final delivery should operate as one shared Intern Management System rather than two unrelated standalone products. The teams are </w:t>
+      </w:r>
+      <w:r>
+        <w:t>working within a shared development project and will connect the relevant data and workflows for the final delivery.</w:t>
+      </w:r>
+    </w:p>
+    <w:p>
+      <w:r>
+        <w:t>To close the workflow gap without adding a full onboarding module, the proposed solution is a minimal Applicant-to-Intern transition. After Team A completes the recruitment process and an applicant is accepted, that person can transition to an active Intern in the shared system. Team B's Intern Task &amp; Progress Management workflow can then continue from that point.</w:t>
+      </w:r>
+    </w:p>
+    <w:p>
+      <w:r>
+        <w:t>The transition is intentionally limited. It is not intended to introduce orientation, training, document management, onboarding checklists or other broader onboarding functions. This keeps the connection between the two workflows clear without expanding the committed Core MVP into a separate onboarding feature set.</w:t>
+      </w:r>
+    </w:p>
+    <w:p>
+      <w:r>
+        <w:t>The client responded positively to the proposed approach and stated that the suggested solutions looked good from their perspective. Additional systems and infrastructure input was invited, so the team will still review any further technical feedback if it is provided.</w:t>
+      </w:r>
+    </w:p>
     <w:p>
       <w:pPr>
         <w:pStyle w:val="Heading1"/>
       </w:pPr>
       <w:r>
-        <w:t>5. Scope and Decision Assessment</w:t>
+        <w:t>4. Team A / Team B Impact Review</w:t>
       </w:r>
     </w:p>
-    <w:tbl>
-      <w:tblPr>
-        <w:tblStyle w:val="TableGrid"/>
-        <w:tblW w:w="0" w:type="auto"/>
-        <w:jc w:val="center"/>
-        <w:tblLook w:val="04A0" w:firstRow="1" w:lastRow="0" w:firstColumn="1" w:lastColumn="0" w:noHBand="0" w:noVBand="1"/>
-      </w:tblPr>
-      <w:tblGrid>
-        <w:gridCol w:w="3360"/>
-        <w:gridCol w:w="3360"/>
-        <w:gridCol w:w="3360"/>
-      </w:tblGrid>
-      <w:tr>
-        <w:trPr>
-          <w:jc w:val="center"/>
-        </w:trPr>
-        <w:tc>
-          <w:tcPr>
-            <w:tcW w:w="3360" w:type="dxa"/>
-          </w:tcPr>
-          <w:p>
-            <w:pPr>
-              <w:spacing w:after="40"/>
-            </w:pPr>
-            <w:r>
-              <w:rPr>
-                <w:b/>
-                <w:sz w:val="18"/>
-              </w:rPr>
-              <w:t>Item</w:t>
-            </w:r>
-          </w:p>
-        </w:tc>
-        <w:tc>
-          <w:tcPr>
-            <w:tcW w:w="3360" w:type="dxa"/>
-          </w:tcPr>
-          <w:p>
-            <w:pPr>
-              <w:spacing w:after="40"/>
-            </w:pPr>
-            <w:r>
-              <w:rPr>
-                <w:b/>
-                <w:sz w:val="18"/>
-              </w:rPr>
-              <w:t>Classification</w:t>
-            </w:r>
-          </w:p>
-        </w:tc>
-        <w:tc>
-          <w:tcPr>
-            <w:tcW w:w="3360" w:type="dxa"/>
-          </w:tcPr>
-          <w:p>
-            <w:pPr>
-              <w:spacing w:after="40"/>
-            </w:pPr>
-            <w:r>
-              <w:rPr>
-                <w:b/>
-                <w:sz w:val="18"/>
-              </w:rPr>
-              <w:t>Decision</w:t>
-            </w:r>
-          </w:p>
-        </w:tc>
-      </w:tr>
-      <w:tr>
-        <w:trPr>
-          <w:jc w:val="center"/>
-        </w:trPr>
-        <w:tc>
-          <w:tcPr>
-            <w:tcW w:w="3360" w:type="dxa"/>
-          </w:tcPr>
-          <w:p>
-            <w:pPr>
-              <w:spacing w:after="40"/>
-            </w:pPr>
-            <w:r>
-              <w:rPr>
-                <w:sz w:val="18"/>
-              </w:rPr>
-              <w:t>Mentor assigns a task</w:t>
-            </w:r>
-          </w:p>
-        </w:tc>
-        <w:tc>
-          <w:tcPr>
-            <w:tcW w:w="3360" w:type="dxa"/>
-          </w:tcPr>
-          <w:p>
-            <w:pPr>
-              <w:spacing w:after="40"/>
-            </w:pPr>
-            <w:r>
-              <w:rPr>
-                <w:sz w:val="18"/>
-              </w:rPr>
-              <w:t>Core MVP</w:t>
-            </w:r>
-          </w:p>
-        </w:tc>
-        <w:tc>
-          <w:tcPr>
-            <w:tcW w:w="3360" w:type="dxa"/>
-          </w:tcPr>
-          <w:p>
-            <w:pPr>
-              <w:spacing w:after="40"/>
-            </w:pPr>
-            <w:r>
-              <w:rPr>
-                <w:sz w:val="18"/>
-              </w:rPr>
-              <w:t>In scope.</w:t>
-            </w:r>
-          </w:p>
-        </w:tc>
-      </w:tr>
-      <w:tr>
-        <w:trPr>
-          <w:jc w:val="center"/>
-        </w:trPr>
-        <w:tc>
-          <w:tcPr>
-            <w:tcW w:w="3360" w:type="dxa"/>
-          </w:tcPr>
-          <w:p>
-            <w:pPr>
-              <w:spacing w:after="40"/>
-            </w:pPr>
-            <w:r>
-              <w:rPr>
-                <w:sz w:val="18"/>
-              </w:rPr>
-              <w:t>Intern views assigned tasks</w:t>
-            </w:r>
-          </w:p>
-        </w:tc>
-        <w:tc>
-          <w:tcPr>
-            <w:tcW w:w="3360" w:type="dxa"/>
-          </w:tcPr>
-          <w:p>
-            <w:pPr>
-              <w:spacing w:after="40"/>
-            </w:pPr>
-            <w:r>
-              <w:rPr>
-                <w:sz w:val="18"/>
-              </w:rPr>
-              <w:t>Core MVP</w:t>
-            </w:r>
-          </w:p>
-        </w:tc>
-        <w:tc>
-          <w:tcPr>
-            <w:tcW w:w="3360" w:type="dxa"/>
-          </w:tcPr>
-          <w:p>
-            <w:pPr>
-              <w:spacing w:after="40"/>
-            </w:pPr>
-            <w:r>
-              <w:rPr>
-                <w:sz w:val="18"/>
-              </w:rPr>
-              <w:t>In scope.</w:t>
-            </w:r>
-          </w:p>
-        </w:tc>
-      </w:tr>
-      <w:tr>
-        <w:trPr>
-          <w:jc w:val="center"/>
-        </w:trPr>
-        <w:tc>
-          <w:tcPr>
-            <w:tcW w:w="3360" w:type="dxa"/>
-          </w:tcPr>
-          <w:p>
-            <w:pPr>
-              <w:spacing w:after="40"/>
-            </w:pPr>
-            <w:r>
-              <w:rPr>
-                <w:sz w:val="18"/>
-              </w:rPr>
-              <w:t>Intern submits weekly progress</w:t>
-            </w:r>
-          </w:p>
-        </w:tc>
-        <w:tc>
-          <w:tcPr>
-            <w:tcW w:w="3360" w:type="dxa"/>
-          </w:tcPr>
-          <w:p>
-            <w:pPr>
-              <w:spacing w:after="40"/>
-            </w:pPr>
-            <w:r>
-              <w:rPr>
-                <w:sz w:val="18"/>
-              </w:rPr>
-              <w:t>Core MVP</w:t>
-            </w:r>
-          </w:p>
-        </w:tc>
-        <w:tc>
-          <w:tcPr>
-            <w:tcW w:w="3360" w:type="dxa"/>
-          </w:tcPr>
-          <w:p>
-            <w:pPr>
-              <w:spacing w:after="40"/>
-            </w:pPr>
-            <w:r>
-              <w:rPr>
-                <w:sz w:val="18"/>
-              </w:rPr>
-              <w:t>In scope.</w:t>
-            </w:r>
-          </w:p>
-        </w:tc>
-      </w:tr>
-      <w:tr>
-        <w:trPr>
-          <w:jc w:val="center"/>
-        </w:trPr>
-        <w:tc>
-          <w:tcPr>
-            <w:tcW w:w="3360" w:type="dxa"/>
-          </w:tcPr>
-          <w:p>
-            <w:pPr>
-              <w:spacing w:after="40"/>
-            </w:pPr>
-            <w:r>
-              <w:rPr>
-                <w:sz w:val="18"/>
-              </w:rPr>
-              <w:t>Mentor reviews progress</w:t>
-            </w:r>
-          </w:p>
-        </w:tc>
-        <w:tc>
-          <w:tcPr>
-            <w:tcW w:w="3360" w:type="dxa"/>
-          </w:tcPr>
-          <w:p>
-            <w:pPr>
-              <w:spacing w:after="40"/>
-            </w:pPr>
-            <w:r>
-              <w:rPr>
-                <w:sz w:val="18"/>
-              </w:rPr>
-              <w:t>Core MVP</w:t>
-            </w:r>
-          </w:p>
-        </w:tc>
-        <w:tc>
-          <w:tcPr>
-            <w:tcW w:w="3360" w:type="dxa"/>
-          </w:tcPr>
-          <w:p>
-            <w:pPr>
-              <w:spacing w:after="40"/>
-            </w:pPr>
-            <w:r>
-              <w:rPr>
-                <w:sz w:val="18"/>
-              </w:rPr>
-              <w:t>In scope.</w:t>
-            </w:r>
-          </w:p>
-        </w:tc>
-      </w:tr>
-      <w:tr>
-        <w:trPr>
-          <w:jc w:val="center"/>
-        </w:trPr>
-        <w:tc>
-          <w:tcPr>
-            <w:tcW w:w="3360" w:type="dxa"/>
-          </w:tcPr>
-          <w:p>
-            <w:pPr>
-              <w:spacing w:after="40"/>
-            </w:pPr>
-            <w:r>
-              <w:rPr>
-                <w:sz w:val="18"/>
-              </w:rPr>
-              <w:t>Minimal Applicant-to-Intern transition</w:t>
-            </w:r>
-          </w:p>
-        </w:tc>
-        <w:tc>
-          <w:tcPr>
-            <w:tcW w:w="3360" w:type="dxa"/>
-          </w:tcPr>
-          <w:p>
-            <w:pPr>
-              <w:spacing w:after="40"/>
-            </w:pPr>
-            <w:r>
-              <w:rPr>
-                <w:sz w:val="18"/>
-              </w:rPr>
-              <w:t>Cross-team scope clarification</w:t>
-            </w:r>
-          </w:p>
-        </w:tc>
-        <w:tc>
-          <w:tcPr>
-            <w:tcW w:w="3360" w:type="dxa"/>
-          </w:tcPr>
-          <w:p>
-            <w:pPr>
-              <w:spacing w:after="40"/>
-            </w:pPr>
-            <w:r>
-              <w:rPr>
-                <w:sz w:val="18"/>
-              </w:rPr>
-              <w:t>Include only the minimum transition needed to connect the workflows.</w:t>
-            </w:r>
-          </w:p>
-        </w:tc>
-      </w:tr>
-      <w:tr>
-        <w:trPr>
-          <w:jc w:val="center"/>
-        </w:trPr>
-        <w:tc>
-          <w:tcPr>
-            <w:tcW w:w="3360" w:type="dxa"/>
-          </w:tcPr>
-          <w:p>
-            <w:pPr>
-              <w:spacing w:after="40"/>
-            </w:pPr>
-            <w:r>
-              <w:rPr>
-                <w:sz w:val="18"/>
-              </w:rPr>
-              <w:t>Full onboarding module</w:t>
-            </w:r>
-          </w:p>
-        </w:tc>
-        <w:tc>
-          <w:tcPr>
-            <w:tcW w:w="3360" w:type="dxa"/>
-          </w:tcPr>
-          <w:p>
-            <w:pPr>
-              <w:spacing w:after="40"/>
-            </w:pPr>
-            <w:r>
-              <w:rPr>
-                <w:sz w:val="18"/>
-              </w:rPr>
-              <w:t>Scope expansion</w:t>
-            </w:r>
-          </w:p>
-        </w:tc>
-        <w:tc>
-          <w:tcPr>
-            <w:tcW w:w="3360" w:type="dxa"/>
-          </w:tcPr>
-          <w:p>
-            <w:pPr>
-              <w:spacing w:after="40"/>
-            </w:pPr>
-            <w:r>
-              <w:rPr>
-                <w:sz w:val="18"/>
-              </w:rPr>
-              <w:t>Do not add to the committed Core MVP.</w:t>
-            </w:r>
-          </w:p>
-        </w:tc>
-      </w:tr>
-      <w:tr>
-        <w:trPr>
-          <w:jc w:val="center"/>
-        </w:trPr>
-        <w:tc>
-          <w:tcPr>
-            <w:tcW w:w="3360" w:type="dxa"/>
-          </w:tcPr>
-          <w:p>
-            <w:pPr>
-              <w:spacing w:after="40"/>
-            </w:pPr>
-            <w:r>
-              <w:rPr>
-                <w:sz w:val="18"/>
-              </w:rPr>
-              <w:t>Basic Mentor feedback</w:t>
-            </w:r>
-          </w:p>
-        </w:tc>
-        <w:tc>
-          <w:tcPr>
-            <w:tcW w:w="3360" w:type="dxa"/>
-          </w:tcPr>
-          <w:p>
-            <w:pPr>
-              <w:spacing w:after="40"/>
-            </w:pPr>
-            <w:r>
-              <w:rPr>
-                <w:sz w:val="18"/>
-              </w:rPr>
-              <w:t>Secondary feature</w:t>
-            </w:r>
-          </w:p>
-        </w:tc>
-        <w:tc>
-          <w:tcPr>
-            <w:tcW w:w="3360" w:type="dxa"/>
-          </w:tcPr>
-          <w:p>
-            <w:pPr>
-              <w:spacing w:after="40"/>
-            </w:pPr>
-            <w:r>
-              <w:rPr>
-                <w:sz w:val="18"/>
-              </w:rPr>
-              <w:t>Consider only if the Core MVP is stable and time allows.</w:t>
-            </w:r>
-          </w:p>
-        </w:tc>
-      </w:tr>
-      <w:tr>
-        <w:trPr>
-          <w:jc w:val="center"/>
-        </w:trPr>
-        <w:tc>
-          <w:tcPr>
-            <w:tcW w:w="3360" w:type="dxa"/>
-          </w:tcPr>
-          <w:p>
-            <w:pPr>
-              <w:spacing w:after="40"/>
-            </w:pPr>
-            <w:r>
-              <w:rPr>
-                <w:sz w:val="18"/>
-              </w:rPr>
-              <w:t>Advanced Mentor feedback / performance evaluation</w:t>
-            </w:r>
-          </w:p>
-        </w:tc>
-        <w:tc>
-          <w:tcPr>
-            <w:tcW w:w="3360" w:type="dxa"/>
-          </w:tcPr>
-          <w:p>
-            <w:pPr>
-              <w:spacing w:after="40"/>
-            </w:pPr>
-            <w:r>
-              <w:rPr>
-                <w:sz w:val="18"/>
-              </w:rPr>
-              <w:t>Out of scope</w:t>
-            </w:r>
-          </w:p>
-        </w:tc>
-        <w:tc>
-          <w:tcPr>
-            <w:tcW w:w="3360" w:type="dxa"/>
-          </w:tcPr>
-          <w:p>
-            <w:pPr>
-              <w:spacing w:after="40"/>
-            </w:pPr>
-            <w:r>
-              <w:rPr>
-                <w:sz w:val="18"/>
-              </w:rPr>
-              <w:t>Do not include in the committed delivery.</w:t>
-            </w:r>
-          </w:p>
-        </w:tc>
-      </w:tr>
-    </w:tbl>
+    <w:p>
+      <w:pPr>
+        <w:pStyle w:val="Heading2"/>
+      </w:pPr>
+      <w:r>
+        <w:t>Team A</w:t>
+      </w:r>
+    </w:p>
+    <w:p>
+      <w:r>
+        <w:t>Responsibility / impact: Recruitment Management up to the point where an applicant is accepted.</w:t>
+      </w:r>
+    </w:p>
+    <w:p>
+      <w:r>
+        <w:t>Project implication: Provides the accepted applicant who can transition into the Intern workflow.</w:t>
+      </w:r>
+    </w:p>
+    <w:p>
+      <w:pPr>
+        <w:pStyle w:val="Heading2"/>
+      </w:pPr>
+      <w:r>
+        <w:t>Shared transition</w:t>
+      </w:r>
+    </w:p>
+    <w:p>
+      <w:r>
+        <w:t>Responsibility / impact: Minimal Applicant-to-Intern transition inside the shared system.</w:t>
+      </w:r>
+    </w:p>
+    <w:p>
+      <w:r>
+        <w:t>Project implication: Connects the two Core MVP workflows without introducing a full onboarding module.</w:t>
+      </w:r>
+    </w:p>
+    <w:p>
+      <w:pPr>
+        <w:pStyle w:val="Heading2"/>
+      </w:pPr>
+      <w:r>
+        <w:t>Team B</w:t>
+      </w:r>
+    </w:p>
+    <w:p>
+      <w:r>
+        <w:t>Responsibility / impact: Intern Task &amp; Progress Management after the person becomes an Intern.</w:t>
+      </w:r>
+    </w:p>
+    <w:p>
+      <w:r>
+        <w:lastRenderedPageBreak/>
+        <w:t>Project implication: Covers task assignment, task viewing, weekly progress submission and Mentor progress review.</w:t>
+      </w:r>
+    </w:p>
+    <w:p>
+      <w:pPr>
+        <w:pStyle w:val="Heading2"/>
+      </w:pPr>
+      <w:r>
+        <w:t>Cross-team coordination</w:t>
+      </w:r>
+    </w:p>
+    <w:p>
+      <w:r>
+        <w:t>Responsibility / impact: Keep the transition and shared workflow consistent across requirements and design.</w:t>
+      </w:r>
+    </w:p>
+    <w:p>
+      <w:r>
+        <w:t>Project implication: BA, UX and PM updates must not create conflicting assumptions between the two teams.</w:t>
+      </w:r>
+    </w:p>
     <w:p>
       <w:pPr>
         <w:pStyle w:val="Heading1"/>
       </w:pPr>
       <w:r>
-        <w:lastRenderedPageBreak/>
-        <w:t>6. Pending Clarifications and Working Assumptions</w:t>
+        <w:t>5. Scope and Decision Assessment</w:t>
       </w:r>
     </w:p>
     <w:p>
-      <w:r>
-        <w:t>The questions below are detailed requirement decisions rather than changes to the overall project direction. The team will continue with the following working assumptions so that BA and UX work can progress. These are not treated as final client decisions and will be updated if the client confirms a different approach.</w:t>
+      <w:pPr>
+        <w:pStyle w:val="Heading2"/>
+      </w:pPr>
+      <w:r>
+        <w:t>Mentor assigns a task</w:t>
       </w:r>
     </w:p>
-    <w:tbl>
-      <w:tblPr>
-        <w:tblStyle w:val="TableGrid"/>
-        <w:tblW w:w="0" w:type="auto"/>
-        <w:jc w:val="center"/>
-        <w:tblLook w:val="04A0" w:firstRow="1" w:lastRow="0" w:firstColumn="1" w:lastColumn="0" w:noHBand="0" w:noVBand="1"/>
-      </w:tblPr>
-      <w:tblGrid>
-        <w:gridCol w:w="3360"/>
-        <w:gridCol w:w="3360"/>
-        <w:gridCol w:w="3360"/>
-      </w:tblGrid>
-      <w:tr>
-        <w:trPr>
-          <w:jc w:val="center"/>
-        </w:trPr>
-        <w:tc>
-          <w:tcPr>
-            <w:tcW w:w="3360" w:type="dxa"/>
-          </w:tcPr>
-          <w:p>
-            <w:pPr>
-              <w:spacing w:after="40"/>
-            </w:pPr>
-            <w:r>
-              <w:rPr>
-                <w:b/>
-                <w:sz w:val="18"/>
-              </w:rPr>
-              <w:t>Pending clarification</w:t>
-            </w:r>
-          </w:p>
-        </w:tc>
-        <w:tc>
-          <w:tcPr>
-            <w:tcW w:w="3360" w:type="dxa"/>
-          </w:tcPr>
-          <w:p>
-            <w:pPr>
-              <w:spacing w:after="40"/>
-            </w:pPr>
-            <w:r>
-              <w:rPr>
-                <w:b/>
-                <w:sz w:val="18"/>
-              </w:rPr>
-              <w:t>Working assumption for current work</w:t>
-            </w:r>
-          </w:p>
-        </w:tc>
-        <w:tc>
-          <w:tcPr>
-            <w:tcW w:w="3360" w:type="dxa"/>
-          </w:tcPr>
-          <w:p>
-            <w:pPr>
-              <w:spacing w:after="40"/>
-            </w:pPr>
-            <w:r>
-              <w:rPr>
-                <w:b/>
-                <w:sz w:val="18"/>
-              </w:rPr>
-              <w:t>If client direction changes</w:t>
-            </w:r>
-          </w:p>
-        </w:tc>
-      </w:tr>
-      <w:tr>
-        <w:trPr>
-          <w:jc w:val="center"/>
-        </w:trPr>
-        <w:tc>
-          <w:tcPr>
-            <w:tcW w:w="3360" w:type="dxa"/>
-          </w:tcPr>
-          <w:p>
-            <w:pPr>
-              <w:spacing w:after="40"/>
-            </w:pPr>
-            <w:r>
-              <w:rPr>
-                <w:sz w:val="18"/>
-              </w:rPr>
-              <w:t>Weekly progress structure</w:t>
-            </w:r>
-          </w:p>
-        </w:tc>
-        <w:tc>
-          <w:tcPr>
-            <w:tcW w:w="3360" w:type="dxa"/>
-          </w:tcPr>
-          <w:p>
-            <w:pPr>
-              <w:spacing w:after="40"/>
-            </w:pPr>
-            <w:r>
-              <w:rPr>
-                <w:sz w:val="18"/>
-              </w:rPr>
-              <w:t>Use one overall weekly progress submission for the Intern rather than a separate report for every task.</w:t>
-            </w:r>
-          </w:p>
-        </w:tc>
-        <w:tc>
-          <w:tcPr>
-            <w:tcW w:w="3360" w:type="dxa"/>
-          </w:tcPr>
-          <w:p>
-            <w:pPr>
-              <w:spacing w:after="40"/>
-            </w:pPr>
-            <w:r>
-              <w:rPr>
-                <w:sz w:val="18"/>
-              </w:rPr>
-              <w:t>BA updates the requirement and UX adjusts the progress flow.</w:t>
-            </w:r>
-          </w:p>
-        </w:tc>
-      </w:tr>
-      <w:tr>
-        <w:trPr>
-          <w:jc w:val="center"/>
-        </w:trPr>
-        <w:tc>
-          <w:tcPr>
-            <w:tcW w:w="3360" w:type="dxa"/>
-          </w:tcPr>
-          <w:p>
-            <w:pPr>
-              <w:spacing w:after="40"/>
-            </w:pPr>
-            <w:r>
-              <w:rPr>
-                <w:sz w:val="18"/>
-              </w:rPr>
-              <w:t>Weekly progress content</w:t>
-            </w:r>
-          </w:p>
-        </w:tc>
-        <w:tc>
-          <w:tcPr>
-            <w:tcW w:w="3360" w:type="dxa"/>
-          </w:tcPr>
-          <w:p>
-            <w:pPr>
-              <w:spacing w:after="40"/>
-            </w:pPr>
-            <w:r>
-              <w:rPr>
-                <w:sz w:val="18"/>
-              </w:rPr>
-              <w:t>Use accomplishments, blockers and next steps as the minimum progress information.</w:t>
-            </w:r>
-          </w:p>
-        </w:tc>
-        <w:tc>
-          <w:tcPr>
-            <w:tcW w:w="3360" w:type="dxa"/>
-          </w:tcPr>
-          <w:p>
-            <w:pPr>
-              <w:spacing w:after="40"/>
-            </w:pPr>
-            <w:r>
-              <w:rPr>
-                <w:sz w:val="18"/>
-              </w:rPr>
-              <w:t>Update the required fields before implementation is finalised.</w:t>
-            </w:r>
-          </w:p>
-        </w:tc>
-      </w:tr>
-      <w:tr>
-        <w:trPr>
-          <w:jc w:val="center"/>
-        </w:trPr>
-        <w:tc>
-          <w:tcPr>
-            <w:tcW w:w="3360" w:type="dxa"/>
-          </w:tcPr>
-          <w:p>
-            <w:pPr>
-              <w:spacing w:after="40"/>
-            </w:pPr>
-            <w:r>
-              <w:rPr>
-                <w:sz w:val="18"/>
-              </w:rPr>
-              <w:t>Task status</w:t>
-            </w:r>
-          </w:p>
-        </w:tc>
-        <w:tc>
-          <w:tcPr>
-            <w:tcW w:w="3360" w:type="dxa"/>
-          </w:tcPr>
-          <w:p>
-            <w:pPr>
-              <w:spacing w:after="40"/>
-            </w:pPr>
-            <w:r>
-              <w:rPr>
-                <w:sz w:val="18"/>
-              </w:rPr>
-              <w:t>Use Assigned, In Progress and Completed as the basic statuses, with the Intern able to update progress-related status.</w:t>
-            </w:r>
-          </w:p>
-        </w:tc>
-        <w:tc>
-          <w:tcPr>
-            <w:tcW w:w="3360" w:type="dxa"/>
-          </w:tcPr>
-          <w:p>
-            <w:pPr>
-              <w:spacing w:after="40"/>
-            </w:pPr>
-            <w:r>
-              <w:rPr>
-                <w:sz w:val="18"/>
-              </w:rPr>
-              <w:t>Revise the status set or responsibility if the client specifies another workflow.</w:t>
-            </w:r>
-          </w:p>
-        </w:tc>
-      </w:tr>
-      <w:tr>
-        <w:trPr>
-          <w:jc w:val="center"/>
-        </w:trPr>
-        <w:tc>
-          <w:tcPr>
-            <w:tcW w:w="3360" w:type="dxa"/>
-          </w:tcPr>
-          <w:p>
-            <w:pPr>
-              <w:spacing w:after="40"/>
-            </w:pPr>
-            <w:r>
-              <w:rPr>
-                <w:sz w:val="18"/>
-              </w:rPr>
-              <w:t>Task assignment</w:t>
-            </w:r>
-          </w:p>
-        </w:tc>
-        <w:tc>
-          <w:tcPr>
-            <w:tcW w:w="3360" w:type="dxa"/>
-          </w:tcPr>
-          <w:p>
-            <w:pPr>
-              <w:spacing w:after="40"/>
-            </w:pPr>
-            <w:r>
-              <w:rPr>
-                <w:sz w:val="18"/>
-              </w:rPr>
-              <w:t>Use title, description, due date, assigned Intern and status as the minimum task information.</w:t>
-            </w:r>
-          </w:p>
-        </w:tc>
-        <w:tc>
-          <w:tcPr>
-            <w:tcW w:w="3360" w:type="dxa"/>
-          </w:tcPr>
-          <w:p>
-            <w:pPr>
-              <w:spacing w:after="40"/>
-            </w:pPr>
-            <w:r>
-              <w:rPr>
-                <w:sz w:val="18"/>
-              </w:rPr>
-              <w:t>Add or remove fields in the requirement and design as confirmed.</w:t>
-            </w:r>
-          </w:p>
-        </w:tc>
-      </w:tr>
-    </w:tbl>
+    <w:p>
+      <w:r>
+        <w:t>Classification: Core MVP</w:t>
+      </w:r>
+    </w:p>
+    <w:p>
+      <w:r>
+        <w:t>Decision: In scope.</w:t>
+      </w:r>
+    </w:p>
+    <w:p>
+      <w:pPr>
+        <w:pStyle w:val="Heading2"/>
+      </w:pPr>
+      <w:r>
+        <w:t>Intern views assigned tasks</w:t>
+      </w:r>
+    </w:p>
+    <w:p>
+      <w:r>
+        <w:t>Classification: Core MVP</w:t>
+      </w:r>
+    </w:p>
+    <w:p>
+      <w:r>
+        <w:t>Decision: In scope.</w:t>
+      </w:r>
+    </w:p>
+    <w:p>
+      <w:pPr>
+        <w:pStyle w:val="Heading2"/>
+      </w:pPr>
+      <w:r>
+        <w:t>Intern submits weekly progress</w:t>
+      </w:r>
+    </w:p>
+    <w:p>
+      <w:r>
+        <w:t>Classification: Core MVP</w:t>
+      </w:r>
+    </w:p>
+    <w:p>
+      <w:r>
+        <w:t>Decision: In scope.</w:t>
+      </w:r>
+    </w:p>
+    <w:p>
+      <w:pPr>
+        <w:pStyle w:val="Heading2"/>
+      </w:pPr>
+      <w:r>
+        <w:t>Mentor reviews progress</w:t>
+      </w:r>
+    </w:p>
+    <w:p>
+      <w:r>
+        <w:t>Classification: Core MVP</w:t>
+      </w:r>
+    </w:p>
+    <w:p>
+      <w:r>
+        <w:t>Decision: In scope.</w:t>
+      </w:r>
+    </w:p>
+    <w:p>
+      <w:pPr>
+        <w:pStyle w:val="Heading2"/>
+      </w:pPr>
+      <w:r>
+        <w:t xml:space="preserve">Minimal </w:t>
+      </w:r>
+      <w:r>
+        <w:t>Applicant-to-Intern transition</w:t>
+      </w:r>
+    </w:p>
+    <w:p>
+      <w:r>
+        <w:t>Classification: Cross-team scope clarification</w:t>
+      </w:r>
+    </w:p>
+    <w:p>
+      <w:r>
+        <w:t>Decision: Include only the minimum transition needed to connect the workflows.</w:t>
+      </w:r>
+    </w:p>
+    <w:p>
+      <w:pPr>
+        <w:pStyle w:val="Heading2"/>
+      </w:pPr>
+      <w:r>
+        <w:t>Full onboarding module</w:t>
+      </w:r>
+    </w:p>
+    <w:p>
+      <w:r>
+        <w:t>Classification: Scope expansion</w:t>
+      </w:r>
+    </w:p>
+    <w:p>
+      <w:r>
+        <w:t>Decision: Do not add to the committed Core MVP.</w:t>
+      </w:r>
+    </w:p>
+    <w:p>
+      <w:pPr>
+        <w:pStyle w:val="Heading2"/>
+      </w:pPr>
+      <w:r>
+        <w:t>Basic Mentor feedback</w:t>
+      </w:r>
+    </w:p>
+    <w:p>
+      <w:r>
+        <w:t>Classification: Secondary feature</w:t>
+      </w:r>
+    </w:p>
+    <w:p>
+      <w:r>
+        <w:t>Decision: Consider only if the Core MVP is stable and time allows.</w:t>
+      </w:r>
+    </w:p>
+    <w:p>
+      <w:pPr>
+        <w:pStyle w:val="Heading2"/>
+      </w:pPr>
+      <w:r>
+        <w:t>Advanced Mentor feedback / performance evaluation</w:t>
+      </w:r>
+    </w:p>
+    <w:p>
+      <w:r>
+        <w:t>Classification: Out of scope</w:t>
+      </w:r>
+    </w:p>
+    <w:p>
+      <w:r>
+        <w:t>Decision: Do not include in the committed delivery.</w:t>
+      </w:r>
+    </w:p>
     <w:p>
       <w:pPr>
         <w:pStyle w:val="Heading1"/>
       </w:pPr>
       <w:r>
-        <w:t>7. Follow-up Actions and Ownership</w:t>
+        <w:lastRenderedPageBreak/>
+        <w:t>6. Pending Clarifications and Working Assumptions</w:t>
       </w:r>
     </w:p>
-    <w:tbl>
-      <w:tblPr>
-        <w:tblStyle w:val="TableGrid"/>
-        <w:tblW w:w="0" w:type="auto"/>
-        <w:jc w:val="center"/>
-        <w:tblLook w:val="04A0" w:firstRow="1" w:lastRow="0" w:firstColumn="1" w:lastColumn="0" w:noHBand="0" w:noVBand="1"/>
-      </w:tblPr>
-      <w:tblGrid>
-        <w:gridCol w:w="2520"/>
-        <w:gridCol w:w="2520"/>
-        <w:gridCol w:w="2520"/>
-        <w:gridCol w:w="2520"/>
-      </w:tblGrid>
-      <w:tr>
-        <w:trPr>
-          <w:jc w:val="center"/>
-        </w:trPr>
-        <w:tc>
-          <w:tcPr>
-            <w:tcW w:w="2520" w:type="dxa"/>
-          </w:tcPr>
-          <w:p>
-            <w:pPr>
-              <w:spacing w:after="40"/>
-            </w:pPr>
-            <w:r>
-              <w:rPr>
-                <w:b/>
-                <w:sz w:val="18"/>
-              </w:rPr>
-              <w:t>Action</w:t>
-            </w:r>
-          </w:p>
-        </w:tc>
-        <w:tc>
-          <w:tcPr>
-            <w:tcW w:w="2520" w:type="dxa"/>
-          </w:tcPr>
-          <w:p>
-            <w:pPr>
-              <w:spacing w:after="40"/>
-            </w:pPr>
-            <w:r>
-              <w:rPr>
-                <w:b/>
-                <w:sz w:val="18"/>
-              </w:rPr>
-              <w:t>Owner</w:t>
-            </w:r>
-          </w:p>
-        </w:tc>
-        <w:tc>
-          <w:tcPr>
-            <w:tcW w:w="2520" w:type="dxa"/>
-          </w:tcPr>
-          <w:p>
-            <w:pPr>
-              <w:spacing w:after="40"/>
-            </w:pPr>
-            <w:r>
-              <w:rPr>
-                <w:b/>
-                <w:sz w:val="18"/>
-              </w:rPr>
-              <w:t>Planner / deliverable impact</w:t>
-            </w:r>
-          </w:p>
-        </w:tc>
-        <w:tc>
-          <w:tcPr>
-            <w:tcW w:w="2520" w:type="dxa"/>
-          </w:tcPr>
-          <w:p>
-            <w:pPr>
-              <w:spacing w:after="40"/>
-            </w:pPr>
-            <w:r>
-              <w:rPr>
-                <w:b/>
-                <w:sz w:val="18"/>
-              </w:rPr>
-              <w:t>Status</w:t>
-            </w:r>
-          </w:p>
-        </w:tc>
-      </w:tr>
-      <w:tr>
-        <w:trPr>
-          <w:jc w:val="center"/>
-        </w:trPr>
-        <w:tc>
-          <w:tcPr>
-            <w:tcW w:w="2520" w:type="dxa"/>
-          </w:tcPr>
-          <w:p>
-            <w:pPr>
-              <w:spacing w:after="40"/>
-            </w:pPr>
-            <w:r>
-              <w:rPr>
-                <w:sz w:val="18"/>
-              </w:rPr>
-              <w:t>Review detailed requirements against the confirmed Core MVP and current assumptions.</w:t>
-            </w:r>
-          </w:p>
-        </w:tc>
-        <w:tc>
-          <w:tcPr>
-            <w:tcW w:w="2520" w:type="dxa"/>
-          </w:tcPr>
-          <w:p>
-            <w:pPr>
-              <w:spacing w:after="40"/>
-            </w:pPr>
-            <w:r>
-              <w:rPr>
-                <w:sz w:val="18"/>
-              </w:rPr>
-              <w:t>BA</w:t>
-            </w:r>
-          </w:p>
-        </w:tc>
-        <w:tc>
-          <w:tcPr>
-            <w:tcW w:w="2520" w:type="dxa"/>
-          </w:tcPr>
-          <w:p>
-            <w:pPr>
-              <w:spacing w:after="40"/>
-            </w:pPr>
-            <w:r>
-              <w:rPr>
-                <w:sz w:val="18"/>
-              </w:rPr>
-              <w:t>Requirements and acceptance criteria.</w:t>
-            </w:r>
-          </w:p>
-        </w:tc>
-        <w:tc>
-          <w:tcPr>
-            <w:tcW w:w="2520" w:type="dxa"/>
-          </w:tcPr>
-          <w:p>
-            <w:pPr>
-              <w:spacing w:after="40"/>
-            </w:pPr>
-            <w:r>
-              <w:rPr>
-                <w:sz w:val="18"/>
-              </w:rPr>
-              <w:t>In progress</w:t>
-            </w:r>
-          </w:p>
-        </w:tc>
-      </w:tr>
-      <w:tr>
-        <w:trPr>
-          <w:jc w:val="center"/>
-        </w:trPr>
-        <w:tc>
-          <w:tcPr>
-            <w:tcW w:w="2520" w:type="dxa"/>
-          </w:tcPr>
-          <w:p>
-            <w:pPr>
-              <w:spacing w:after="40"/>
-            </w:pPr>
-            <w:r>
-              <w:rPr>
-                <w:sz w:val="18"/>
-              </w:rPr>
-              <w:t>Complete a separate requirements review of the detailed wireframes before prototyping.</w:t>
-            </w:r>
-          </w:p>
-        </w:tc>
-        <w:tc>
-          <w:tcPr>
-            <w:tcW w:w="2520" w:type="dxa"/>
-          </w:tcPr>
-          <w:p>
-            <w:pPr>
-              <w:spacing w:after="40"/>
-            </w:pPr>
-            <w:r>
-              <w:rPr>
-                <w:sz w:val="18"/>
-              </w:rPr>
-              <w:t>BA</w:t>
-            </w:r>
-          </w:p>
-        </w:tc>
-        <w:tc>
-          <w:tcPr>
-            <w:tcW w:w="2520" w:type="dxa"/>
-          </w:tcPr>
-          <w:p>
-            <w:pPr>
-              <w:spacing w:after="40"/>
-            </w:pPr>
-            <w:r>
-              <w:rPr>
-                <w:sz w:val="18"/>
-              </w:rPr>
-              <w:t>BA wireframe review task.</w:t>
-            </w:r>
-          </w:p>
-        </w:tc>
-        <w:tc>
-          <w:tcPr>
-            <w:tcW w:w="2520" w:type="dxa"/>
-          </w:tcPr>
-          <w:p>
-            <w:pPr>
-              <w:spacing w:after="40"/>
-            </w:pPr>
-            <w:r>
-              <w:rPr>
-                <w:sz w:val="18"/>
-              </w:rPr>
-              <w:t>Planned</w:t>
-            </w:r>
-          </w:p>
-        </w:tc>
-      </w:tr>
-      <w:tr>
-        <w:trPr>
-          <w:jc w:val="center"/>
-        </w:trPr>
-        <w:tc>
-          <w:tcPr>
-            <w:tcW w:w="2520" w:type="dxa"/>
-          </w:tcPr>
-          <w:p>
-            <w:pPr>
-              <w:spacing w:after="40"/>
-            </w:pPr>
-            <w:r>
-              <w:rPr>
-                <w:sz w:val="18"/>
-              </w:rPr>
-              <w:t>Revise wireframes following review and complete the Core MVP prototype earlier so Week 3 can focus on testing and refinement.</w:t>
-            </w:r>
-          </w:p>
-        </w:tc>
-        <w:tc>
-          <w:tcPr>
-            <w:tcW w:w="2520" w:type="dxa"/>
-          </w:tcPr>
-          <w:p>
-            <w:pPr>
-              <w:spacing w:after="40"/>
-            </w:pPr>
-            <w:r>
-              <w:rPr>
-                <w:sz w:val="18"/>
-              </w:rPr>
-              <w:t>UX</w:t>
-            </w:r>
-          </w:p>
-        </w:tc>
-        <w:tc>
-          <w:tcPr>
-            <w:tcW w:w="2520" w:type="dxa"/>
-          </w:tcPr>
-          <w:p>
-            <w:pPr>
-              <w:spacing w:after="40"/>
-            </w:pPr>
-            <w:r>
-              <w:rPr>
-                <w:sz w:val="18"/>
-              </w:rPr>
-              <w:t>UX revision and prototype task.</w:t>
-            </w:r>
-          </w:p>
-        </w:tc>
-        <w:tc>
-          <w:tcPr>
-            <w:tcW w:w="2520" w:type="dxa"/>
-          </w:tcPr>
-          <w:p>
-            <w:pPr>
-              <w:spacing w:after="40"/>
-            </w:pPr>
-            <w:r>
-              <w:rPr>
-                <w:sz w:val="18"/>
-              </w:rPr>
-              <w:t>Planned</w:t>
-            </w:r>
-          </w:p>
-        </w:tc>
-      </w:tr>
-      <w:tr>
-        <w:trPr>
-          <w:jc w:val="center"/>
-        </w:trPr>
-        <w:tc>
-          <w:tcPr>
-            <w:tcW w:w="2520" w:type="dxa"/>
-          </w:tcPr>
-          <w:p>
-            <w:pPr>
-              <w:spacing w:after="40"/>
-            </w:pPr>
-            <w:r>
-              <w:rPr>
-                <w:sz w:val="18"/>
-              </w:rPr>
-              <w:t>Maintain consistency between Team A recruitment output and Team B Intern workflow.</w:t>
-            </w:r>
-          </w:p>
-        </w:tc>
-        <w:tc>
-          <w:tcPr>
-            <w:tcW w:w="2520" w:type="dxa"/>
-          </w:tcPr>
-          <w:p>
-            <w:pPr>
-              <w:spacing w:after="40"/>
-            </w:pPr>
-            <w:r>
-              <w:rPr>
-                <w:sz w:val="18"/>
-              </w:rPr>
-              <w:t>Team A + Team B</w:t>
-            </w:r>
-          </w:p>
-        </w:tc>
-        <w:tc>
-          <w:tcPr>
-            <w:tcW w:w="2520" w:type="dxa"/>
-          </w:tcPr>
-          <w:p>
-            <w:pPr>
-              <w:spacing w:after="40"/>
-            </w:pPr>
-            <w:r>
-              <w:rPr>
-                <w:sz w:val="18"/>
-              </w:rPr>
-              <w:t>Cross-team requirements and workflow.</w:t>
-            </w:r>
-          </w:p>
-        </w:tc>
-        <w:tc>
-          <w:tcPr>
-            <w:tcW w:w="2520" w:type="dxa"/>
-          </w:tcPr>
-          <w:p>
-            <w:pPr>
-              <w:spacing w:after="40"/>
-            </w:pPr>
-            <w:r>
-              <w:rPr>
-                <w:sz w:val="18"/>
-              </w:rPr>
-              <w:t>Ongoing</w:t>
-            </w:r>
-          </w:p>
-        </w:tc>
-      </w:tr>
-      <w:tr>
-        <w:trPr>
-          <w:jc w:val="center"/>
-        </w:trPr>
-        <w:tc>
-          <w:tcPr>
-            <w:tcW w:w="2520" w:type="dxa"/>
-          </w:tcPr>
-          <w:p>
-            <w:pPr>
-              <w:spacing w:after="40"/>
-            </w:pPr>
-            <w:r>
-              <w:rPr>
-                <w:sz w:val="18"/>
-              </w:rPr>
-              <w:t>Track outstanding client questions and record any confirmed changes.</w:t>
-            </w:r>
-          </w:p>
-        </w:tc>
-        <w:tc>
-          <w:tcPr>
-            <w:tcW w:w="2520" w:type="dxa"/>
-          </w:tcPr>
-          <w:p>
-            <w:pPr>
-              <w:spacing w:after="40"/>
-            </w:pPr>
-            <w:r>
-              <w:rPr>
-                <w:sz w:val="18"/>
-              </w:rPr>
-              <w:t>PM</w:t>
-            </w:r>
-          </w:p>
-        </w:tc>
-        <w:tc>
-          <w:tcPr>
-            <w:tcW w:w="2520" w:type="dxa"/>
-          </w:tcPr>
-          <w:p>
-            <w:pPr>
-              <w:spacing w:after="40"/>
-            </w:pPr>
-            <w:r>
-              <w:rPr>
-                <w:sz w:val="18"/>
-              </w:rPr>
-              <w:t>Stakeholder management and decision record.</w:t>
-            </w:r>
-          </w:p>
-        </w:tc>
-        <w:tc>
-          <w:tcPr>
-            <w:tcW w:w="2520" w:type="dxa"/>
-          </w:tcPr>
-          <w:p>
-            <w:pPr>
-              <w:spacing w:after="40"/>
-            </w:pPr>
-            <w:r>
-              <w:rPr>
-                <w:sz w:val="18"/>
-              </w:rPr>
-              <w:t>Ongoing</w:t>
-            </w:r>
-          </w:p>
-        </w:tc>
-      </w:tr>
-      <w:tr>
-        <w:trPr>
-          <w:jc w:val="center"/>
-        </w:trPr>
-        <w:tc>
-          <w:tcPr>
-            <w:tcW w:w="2520" w:type="dxa"/>
-          </w:tcPr>
-          <w:p>
-            <w:pPr>
-              <w:spacing w:after="40"/>
-            </w:pPr>
-            <w:r>
-              <w:rPr>
-                <w:sz w:val="18"/>
-              </w:rPr>
-              <w:t>Update Planner tasks, due dates and task notes when stakeholder decisions affect planned work.</w:t>
-            </w:r>
-          </w:p>
-        </w:tc>
-        <w:tc>
-          <w:tcPr>
-            <w:tcW w:w="2520" w:type="dxa"/>
-          </w:tcPr>
-          <w:p>
-            <w:pPr>
-              <w:spacing w:after="40"/>
-            </w:pPr>
-            <w:r>
-              <w:rPr>
-                <w:sz w:val="18"/>
-              </w:rPr>
-              <w:t>PM</w:t>
-            </w:r>
-          </w:p>
-        </w:tc>
-        <w:tc>
-          <w:tcPr>
-            <w:tcW w:w="2520" w:type="dxa"/>
-          </w:tcPr>
-          <w:p>
-            <w:pPr>
-              <w:spacing w:after="40"/>
-            </w:pPr>
-            <w:r>
-              <w:rPr>
-                <w:sz w:val="18"/>
-              </w:rPr>
-              <w:t>Planner board and sprint evidence.</w:t>
-            </w:r>
-          </w:p>
-        </w:tc>
-        <w:tc>
-          <w:tcPr>
-            <w:tcW w:w="2520" w:type="dxa"/>
-          </w:tcPr>
-          <w:p>
-            <w:pPr>
-              <w:spacing w:after="40"/>
-            </w:pPr>
-            <w:r>
-              <w:rPr>
-                <w:sz w:val="18"/>
-              </w:rPr>
-              <w:t>Ongoing</w:t>
-            </w:r>
-          </w:p>
-        </w:tc>
-      </w:tr>
-    </w:tbl>
+    <w:p>
+      <w:r>
+        <w:t>The questions below are detailed requirement decisions rather than changes to the overall project direction. The team will continue with the following working assumptions so that BA and UX work can progress. These are not treated as final client decisions and will be updated if the client confirms a different approach.</w:t>
+      </w:r>
+    </w:p>
+    <w:p>
+      <w:pPr>
+        <w:pStyle w:val="Heading2"/>
+      </w:pPr>
+      <w:r>
+        <w:t>Weekly progress structure</w:t>
+      </w:r>
+    </w:p>
+    <w:p>
+      <w:r>
+        <w:t>Working assumption: Use one overall weekly progress submission for the Intern rather than a separate report for every task.</w:t>
+      </w:r>
+    </w:p>
+    <w:p>
+      <w:r>
+        <w:t>If client direction changes: BA updates the requirement and UX adjusts the progress flow.</w:t>
+      </w:r>
+    </w:p>
+    <w:p>
+      <w:pPr>
+        <w:pStyle w:val="Heading2"/>
+      </w:pPr>
+      <w:r>
+        <w:t>Weekly progress content</w:t>
+      </w:r>
+    </w:p>
+    <w:p>
+      <w:r>
+        <w:t>Working assumption: Use accomplishments, blockers and next steps as the minimum progress information.</w:t>
+      </w:r>
+    </w:p>
+    <w:p>
+      <w:r>
+        <w:t>If client direction changes: Update the required fields before implementation is finalised.</w:t>
+      </w:r>
+    </w:p>
+    <w:p>
+      <w:pPr>
+        <w:pStyle w:val="Heading2"/>
+      </w:pPr>
+      <w:r>
+        <w:t>Task status</w:t>
+      </w:r>
+    </w:p>
+    <w:p>
+      <w:r>
+        <w:t>Working assumption: Use Assigned, In Progress and Completed as the basic statuses, with the Intern able to update progress-related status.</w:t>
+      </w:r>
+    </w:p>
+    <w:p>
+      <w:r>
+        <w:t>If client direction changes: Revise the status set or responsibility if the client specifies another workflow.</w:t>
+      </w:r>
+    </w:p>
+    <w:p>
+      <w:pPr>
+        <w:pStyle w:val="Heading2"/>
+      </w:pPr>
+      <w:r>
+        <w:t>Task assignment</w:t>
+      </w:r>
+    </w:p>
+    <w:p>
+      <w:r>
+        <w:t>Working assumption: Use title, description, due date, assigned Intern and status as the minimum task information.</w:t>
+      </w:r>
+    </w:p>
+    <w:p>
+      <w:r>
+        <w:t>If client direction changes: Add or remove fields in the requirement and design as confirmed.</w:t>
+      </w:r>
+    </w:p>
     <w:p>
       <w:pPr>
         <w:pStyle w:val="Heading1"/>
       </w:pPr>
       <w:r>
+        <w:t>7. Follow-up Actions and Ownership</w:t>
+      </w:r>
+    </w:p>
+    <w:p>
+      <w:pPr>
+        <w:pStyle w:val="Heading2"/>
+      </w:pPr>
+      <w:r>
+        <w:t>BA - Requirements review</w:t>
+      </w:r>
+    </w:p>
+    <w:p>
+      <w:r>
+        <w:t>Action: Review detailed requirements against the confirmed Core MVP and current assumptions.</w:t>
+      </w:r>
+    </w:p>
+    <w:p>
+      <w:r>
+        <w:t xml:space="preserve">Planner / deliverable impact: Requirements and </w:t>
+      </w:r>
+      <w:r>
+        <w:t>acceptance criteria.</w:t>
+      </w:r>
+    </w:p>
+    <w:p>
+      <w:r>
+        <w:t>Status: In progress.</w:t>
+      </w:r>
+    </w:p>
+    <w:p>
+      <w:pPr>
+        <w:pStyle w:val="Heading2"/>
+      </w:pPr>
+      <w:r>
+        <w:t>BA - Wireframe requirements review</w:t>
+      </w:r>
+    </w:p>
+    <w:p>
+      <w:r>
+        <w:t>Action: Complete a separate requirements review of the detailed wireframes before prototyping.</w:t>
+      </w:r>
+    </w:p>
+    <w:p>
+      <w:r>
+        <w:t>Planner / deliverable impact: BA wireframe review task.</w:t>
+      </w:r>
+    </w:p>
+    <w:p>
+      <w:r>
+        <w:t>Status: Planned.</w:t>
+      </w:r>
+    </w:p>
+    <w:p>
+      <w:pPr>
+        <w:pStyle w:val="Heading2"/>
+      </w:pPr>
+      <w:r>
+        <w:t>UX - Wireframe revision and prototype</w:t>
+      </w:r>
+    </w:p>
+    <w:p>
+      <w:r>
+        <w:t>Action: Revise wireframes following review and complete the Core MVP prototype earlier so Week 3 can focus on testing and refinement.</w:t>
+      </w:r>
+    </w:p>
+    <w:p>
+      <w:r>
+        <w:t>Planner / deliverable impact: UX revision and prototype task.</w:t>
+      </w:r>
+    </w:p>
+    <w:p>
+      <w:r>
+        <w:t>Status: Planned.</w:t>
+      </w:r>
+    </w:p>
+    <w:p>
+      <w:pPr>
+        <w:pStyle w:val="Heading2"/>
+      </w:pPr>
+      <w:r>
+        <w:lastRenderedPageBreak/>
+        <w:t>Team A + Team B - Cross-team consistency</w:t>
+      </w:r>
+    </w:p>
+    <w:p>
+      <w:r>
+        <w:t>Action: Maintain consistency between Team A recruitment output and Team B Intern workflow.</w:t>
+      </w:r>
+    </w:p>
+    <w:p>
+      <w:r>
+        <w:t>Planner / deliverable impact: Cross-team requirements and workflow.</w:t>
+      </w:r>
+    </w:p>
+    <w:p>
+      <w:r>
+        <w:t>Status: Ongoing.</w:t>
+      </w:r>
+    </w:p>
+    <w:p>
+      <w:pPr>
+        <w:pStyle w:val="Heading2"/>
+      </w:pPr>
+      <w:r>
+        <w:t>PM - Client clarification tracking</w:t>
+      </w:r>
+    </w:p>
+    <w:p>
+      <w:r>
+        <w:t xml:space="preserve">Action: Track </w:t>
+      </w:r>
+      <w:r>
+        <w:t>outstanding client questions and record any confirmed changes.</w:t>
+      </w:r>
+    </w:p>
+    <w:p>
+      <w:r>
+        <w:t>Planner / deliverable impact: Stakeholder management and decision record.</w:t>
+      </w:r>
+    </w:p>
+    <w:p>
+      <w:r>
+        <w:t>Status: Ongoing.</w:t>
+      </w:r>
+    </w:p>
+    <w:p>
+      <w:pPr>
+        <w:pStyle w:val="Heading2"/>
+      </w:pPr>
+      <w:r>
+        <w:t>PM - Planner maintenance</w:t>
+      </w:r>
+    </w:p>
+    <w:p>
+      <w:r>
+        <w:t>Action: Update Planner tasks, due dates and task notes when stakeholder decisions affect planned work.</w:t>
+      </w:r>
+    </w:p>
+    <w:p>
+      <w:r>
+        <w:t>Planner / deliverable impact: Planner board and sprint evidence.</w:t>
+      </w:r>
+    </w:p>
+    <w:p>
+      <w:r>
+        <w:t>Status: Ongoing.</w:t>
+      </w:r>
+    </w:p>
+    <w:p>
+      <w:pPr>
+        <w:pStyle w:val="Heading1"/>
+      </w:pPr>
+      <w:r>
         <w:t>8. Evidence and Decision Log</w:t>
       </w:r>
     </w:p>
-    <w:tbl>
-      <w:tblPr>
-        <w:tblStyle w:val="TableGrid"/>
-        <w:tblW w:w="0" w:type="auto"/>
-        <w:jc w:val="center"/>
-        <w:tblLook w:val="04A0" w:firstRow="1" w:lastRow="0" w:firstColumn="1" w:lastColumn="0" w:noHBand="0" w:noVBand="1"/>
-      </w:tblPr>
-      <w:tblGrid>
-        <w:gridCol w:w="3360"/>
-        <w:gridCol w:w="3360"/>
-        <w:gridCol w:w="3360"/>
-      </w:tblGrid>
-      <w:tr>
-        <w:trPr>
-          <w:jc w:val="center"/>
-        </w:trPr>
-        <w:tc>
-          <w:tcPr>
-            <w:tcW w:w="3360" w:type="dxa"/>
-          </w:tcPr>
-          <w:p>
-            <w:pPr>
-              <w:spacing w:after="40"/>
-            </w:pPr>
-            <w:r>
-              <w:rPr>
-                <w:b/>
-                <w:sz w:val="18"/>
-              </w:rPr>
-              <w:t>Date</w:t>
-            </w:r>
-          </w:p>
-        </w:tc>
-        <w:tc>
-          <w:tcPr>
-            <w:tcW w:w="3360" w:type="dxa"/>
-          </w:tcPr>
-          <w:p>
-            <w:pPr>
-              <w:spacing w:after="40"/>
-            </w:pPr>
-            <w:r>
-              <w:rPr>
-                <w:b/>
-                <w:sz w:val="18"/>
-              </w:rPr>
-              <w:t>Evidence / event</w:t>
-            </w:r>
-          </w:p>
-        </w:tc>
-        <w:tc>
-          <w:tcPr>
-            <w:tcW w:w="3360" w:type="dxa"/>
-          </w:tcPr>
-          <w:p>
-            <w:pPr>
-              <w:spacing w:after="40"/>
-            </w:pPr>
-            <w:r>
-              <w:rPr>
-                <w:b/>
-                <w:sz w:val="18"/>
-              </w:rPr>
-              <w:t>Outcome</w:t>
-            </w:r>
-          </w:p>
-        </w:tc>
-      </w:tr>
-      <w:tr>
-        <w:trPr>
-          <w:jc w:val="center"/>
-        </w:trPr>
-        <w:tc>
-          <w:tcPr>
-            <w:tcW w:w="3360" w:type="dxa"/>
-          </w:tcPr>
-          <w:p>
-            <w:pPr>
-              <w:spacing w:after="40"/>
-            </w:pPr>
-            <w:r>
-              <w:rPr>
-                <w:sz w:val="18"/>
-              </w:rPr>
-              <w:t>21 Aug 2026</w:t>
-            </w:r>
-          </w:p>
-        </w:tc>
-        <w:tc>
-          <w:tcPr>
-            <w:tcW w:w="3360" w:type="dxa"/>
-          </w:tcPr>
-          <w:p>
-            <w:pPr>
-              <w:spacing w:after="40"/>
-            </w:pPr>
-            <w:r>
-              <w:rPr>
-                <w:sz w:val="18"/>
-              </w:rPr>
-              <w:t>Revised project proposal signed by the client.</w:t>
-            </w:r>
-          </w:p>
-        </w:tc>
-        <w:tc>
-          <w:tcPr>
-            <w:tcW w:w="3360" w:type="dxa"/>
-          </w:tcPr>
-          <w:p>
-            <w:pPr>
-              <w:spacing w:after="40"/>
-            </w:pPr>
-            <w:r>
-              <w:rPr>
-                <w:sz w:val="18"/>
-              </w:rPr>
-              <w:t>Current project baseline confirmed.</w:t>
-            </w:r>
-          </w:p>
-        </w:tc>
-      </w:tr>
-      <w:tr>
-        <w:trPr>
-          <w:jc w:val="center"/>
-        </w:trPr>
-        <w:tc>
-          <w:tcPr>
-            <w:tcW w:w="3360" w:type="dxa"/>
-          </w:tcPr>
-          <w:p>
-            <w:pPr>
-              <w:spacing w:after="40"/>
-            </w:pPr>
-            <w:r>
-              <w:rPr>
-                <w:sz w:val="18"/>
-              </w:rPr>
-              <w:t>22 Aug 2026</w:t>
-            </w:r>
-          </w:p>
-        </w:tc>
-        <w:tc>
-          <w:tcPr>
-            <w:tcW w:w="3360" w:type="dxa"/>
-          </w:tcPr>
-          <w:p>
-            <w:pPr>
-              <w:spacing w:after="40"/>
-            </w:pPr>
-            <w:r>
-              <w:rPr>
-                <w:sz w:val="18"/>
-              </w:rPr>
-              <w:t>Client raised the potential onboarding and integration gap between Team A and Team B.</w:t>
-            </w:r>
-          </w:p>
-        </w:tc>
-        <w:tc>
-          <w:tcPr>
-            <w:tcW w:w="3360" w:type="dxa"/>
-          </w:tcPr>
-          <w:p>
-            <w:pPr>
-              <w:spacing w:after="40"/>
-            </w:pPr>
-            <w:r>
-              <w:rPr>
-                <w:sz w:val="18"/>
-              </w:rPr>
-              <w:t>Cross-team review required.</w:t>
-            </w:r>
-          </w:p>
-        </w:tc>
-      </w:tr>
-      <w:tr>
-        <w:trPr>
-          <w:jc w:val="center"/>
-        </w:trPr>
-        <w:tc>
-          <w:tcPr>
-            <w:tcW w:w="3360" w:type="dxa"/>
-          </w:tcPr>
-          <w:p>
-            <w:pPr>
-              <w:spacing w:after="40"/>
-            </w:pPr>
-            <w:r>
-              <w:rPr>
-                <w:sz w:val="18"/>
-              </w:rPr>
-              <w:lastRenderedPageBreak/>
-              <w:t>26 Aug 2026</w:t>
-            </w:r>
-          </w:p>
-        </w:tc>
-        <w:tc>
-          <w:tcPr>
-            <w:tcW w:w="3360" w:type="dxa"/>
-          </w:tcPr>
-          <w:p>
-            <w:pPr>
-              <w:spacing w:after="40"/>
-            </w:pPr>
-            <w:r>
-              <w:rPr>
-                <w:sz w:val="18"/>
-              </w:rPr>
-              <w:t>Team proposed the shared-system approach and minimal Applicant-to-Intern transition, together with four detailed Core MVP questions.</w:t>
-            </w:r>
-          </w:p>
-        </w:tc>
-        <w:tc>
-          <w:tcPr>
-            <w:tcW w:w="3360" w:type="dxa"/>
-          </w:tcPr>
-          <w:p>
-            <w:pPr>
-              <w:spacing w:after="40"/>
-            </w:pPr>
-            <w:r>
-              <w:rPr>
-                <w:sz w:val="18"/>
-              </w:rPr>
-              <w:t>Resolution and clarification request sent to the client.</w:t>
-            </w:r>
-          </w:p>
-        </w:tc>
-      </w:tr>
-      <w:tr>
-        <w:trPr>
-          <w:jc w:val="center"/>
-        </w:trPr>
-        <w:tc>
-          <w:tcPr>
-            <w:tcW w:w="3360" w:type="dxa"/>
-          </w:tcPr>
-          <w:p>
-            <w:pPr>
-              <w:spacing w:after="40"/>
-            </w:pPr>
-            <w:r>
-              <w:rPr>
-                <w:sz w:val="18"/>
-              </w:rPr>
-              <w:t>26 Aug 2026</w:t>
-            </w:r>
-          </w:p>
-        </w:tc>
-        <w:tc>
-          <w:tcPr>
-            <w:tcW w:w="3360" w:type="dxa"/>
-          </w:tcPr>
-          <w:p>
-            <w:pPr>
-              <w:spacing w:after="40"/>
-            </w:pPr>
-            <w:r>
-              <w:rPr>
-                <w:sz w:val="18"/>
-              </w:rPr>
-              <w:t>Client responded positively to the proposed solutions and invited further systems/infrastructure input.</w:t>
-            </w:r>
-          </w:p>
-        </w:tc>
-        <w:tc>
-          <w:tcPr>
-            <w:tcW w:w="3360" w:type="dxa"/>
-          </w:tcPr>
-          <w:p>
-            <w:pPr>
-              <w:spacing w:after="40"/>
-            </w:pPr>
-            <w:r>
-              <w:rPr>
-                <w:sz w:val="18"/>
-              </w:rPr>
-              <w:t>Team continued with the agreed direction while monitoring further feedback.</w:t>
-            </w:r>
-          </w:p>
-        </w:tc>
-      </w:tr>
-      <w:tr>
-        <w:trPr>
-          <w:jc w:val="center"/>
-        </w:trPr>
-        <w:tc>
-          <w:tcPr>
-            <w:tcW w:w="3360" w:type="dxa"/>
-          </w:tcPr>
-          <w:p>
-            <w:pPr>
-              <w:spacing w:after="40"/>
-            </w:pPr>
-            <w:r>
-              <w:rPr>
-                <w:sz w:val="18"/>
-              </w:rPr>
-              <w:t>Current</w:t>
-            </w:r>
-          </w:p>
-        </w:tc>
-        <w:tc>
-          <w:tcPr>
-            <w:tcW w:w="3360" w:type="dxa"/>
-          </w:tcPr>
-          <w:p>
-            <w:pPr>
-              <w:spacing w:after="40"/>
-            </w:pPr>
-            <w:r>
-              <w:rPr>
-                <w:sz w:val="18"/>
-              </w:rPr>
-              <w:t>Detailed client questions remain open.</w:t>
-            </w:r>
-          </w:p>
-        </w:tc>
-        <w:tc>
-          <w:tcPr>
-            <w:tcW w:w="3360" w:type="dxa"/>
-          </w:tcPr>
-          <w:p>
-            <w:pPr>
-              <w:spacing w:after="40"/>
-            </w:pPr>
-            <w:r>
-              <w:rPr>
-                <w:sz w:val="18"/>
-              </w:rPr>
-              <w:t>Work continues using documented assumptions; affected work will be revised if required.</w:t>
-            </w:r>
-          </w:p>
-        </w:tc>
-      </w:tr>
-    </w:tbl>
-    <w:p/>
+    <w:p>
+      <w:pPr>
+        <w:pStyle w:val="Heading2"/>
+      </w:pPr>
+      <w:r>
+        <w:t>21 Aug 2026</w:t>
+      </w:r>
+    </w:p>
+    <w:p>
+      <w:r>
+        <w:t>Evidence / event: Revised project proposal signed by the client.</w:t>
+      </w:r>
+    </w:p>
+    <w:p>
+      <w:r>
+        <w:t>Outcome: Current project baseline confirmed.</w:t>
+      </w:r>
+    </w:p>
+    <w:p>
+      <w:pPr>
+        <w:pStyle w:val="Heading2"/>
+      </w:pPr>
+      <w:r>
+        <w:t>22 Aug 2026</w:t>
+      </w:r>
+    </w:p>
+    <w:p>
+      <w:r>
+        <w:t>Evidence / event: Client raised the potential onboarding and integration gap between Team A and Team B.</w:t>
+      </w:r>
+    </w:p>
+    <w:p>
+      <w:r>
+        <w:t>Outcome: Cross-team review required.</w:t>
+      </w:r>
+    </w:p>
+    <w:p>
+      <w:pPr>
+        <w:pStyle w:val="Heading2"/>
+      </w:pPr>
+      <w:r>
+        <w:t>26 Aug 2026</w:t>
+      </w:r>
+    </w:p>
+    <w:p>
+      <w:r>
+        <w:t xml:space="preserve">Evidence / event: Team proposed the shared-system approach and minimal </w:t>
+      </w:r>
+      <w:r>
+        <w:t>Applicant-to-Intern transition, together with four detailed Core MVP questions.</w:t>
+      </w:r>
+    </w:p>
+    <w:p>
+      <w:r>
+        <w:t>Outcome: Resolution and clarification request sent to the client.</w:t>
+      </w:r>
+    </w:p>
+    <w:p>
+      <w:pPr>
+        <w:pStyle w:val="Heading2"/>
+      </w:pPr>
+      <w:r>
+        <w:t>26 Aug 2026</w:t>
+      </w:r>
+    </w:p>
+    <w:p>
+      <w:r>
+        <w:t>Evidence / event: Client responded positively to the proposed solutions and invited further systems/infrastructure input.</w:t>
+      </w:r>
+    </w:p>
+    <w:p>
+      <w:r>
+        <w:t>Outcome: Team continued with the agreed direction while monitoring further feedback.</w:t>
+      </w:r>
+    </w:p>
+    <w:p>
+      <w:pPr>
+        <w:pStyle w:val="Heading2"/>
+      </w:pPr>
+      <w:r>
+        <w:t>Current</w:t>
+      </w:r>
+    </w:p>
+    <w:p>
+      <w:r>
+        <w:t>Evidence / event: Detailed client questions remain open.</w:t>
+      </w:r>
+    </w:p>
+    <w:p>
+      <w:r>
+        <w:t>Outcome: Work continues using documented assumptions; affected work will be revised if required.</w:t>
+      </w:r>
+    </w:p>
     <w:sectPr>
       <w:pgSz w:w="12240" w:h="15840"/>
-      <w:pgMar w:top="1008" w:right="1080" w:bottom="1008" w:left="1080" w:header="720" w:footer="720" w:gutter="0"/>
+      <w:pgMar w:top="1008" w:right="1152" w:bottom="1008" w:left="1152" w:header="720" w:footer="720" w:gutter="0"/>
       <w:cols w:space="720"/>
       <w:docGrid w:linePitch="360"/>
     </w:sectPr>
@@ -2645,31 +970,31 @@
       </w:rPr>
     </w:lvl>
   </w:abstractNum>
-  <w:num w:numId="1" w16cid:durableId="882836431">
+  <w:num w:numId="1" w16cid:durableId="159396339">
     <w:abstractNumId w:val="8"/>
   </w:num>
-  <w:num w:numId="2" w16cid:durableId="939528141">
+  <w:num w:numId="2" w16cid:durableId="1998410623">
     <w:abstractNumId w:val="6"/>
   </w:num>
-  <w:num w:numId="3" w16cid:durableId="1757092891">
+  <w:num w:numId="3" w16cid:durableId="1704750176">
     <w:abstractNumId w:val="5"/>
   </w:num>
-  <w:num w:numId="4" w16cid:durableId="1400514681">
+  <w:num w:numId="4" w16cid:durableId="1791589125">
     <w:abstractNumId w:val="4"/>
   </w:num>
-  <w:num w:numId="5" w16cid:durableId="42142592">
+  <w:num w:numId="5" w16cid:durableId="1549026360">
     <w:abstractNumId w:val="7"/>
   </w:num>
-  <w:num w:numId="6" w16cid:durableId="637228773">
+  <w:num w:numId="6" w16cid:durableId="1430002968">
     <w:abstractNumId w:val="3"/>
   </w:num>
-  <w:num w:numId="7" w16cid:durableId="215089877">
+  <w:num w:numId="7" w16cid:durableId="2021393445">
     <w:abstractNumId w:val="2"/>
   </w:num>
-  <w:num w:numId="8" w16cid:durableId="555775649">
+  <w:num w:numId="8" w16cid:durableId="2130053059">
     <w:abstractNumId w:val="1"/>
   </w:num>
-  <w:num w:numId="9" w16cid:durableId="2032565942">
+  <w:num w:numId="9" w16cid:durableId="186412548">
     <w:abstractNumId w:val="0"/>
   </w:num>
 </w:numbering>
@@ -3065,12 +1390,9 @@
     <w:name w:val="Normal"/>
     <w:qFormat/>
     <w:rsid w:val="00FC693F"/>
-    <w:pPr>
-      <w:spacing w:after="100" w:line="259" w:lineRule="auto"/>
-    </w:pPr>
     <w:rPr>
-      <w:rFonts w:ascii="Calibri" w:hAnsi="Calibri"/>
-      <w:sz w:val="21"/>
+      <w:rFonts w:ascii="Arial" w:hAnsi="Arial"/>
+      <w:sz w:val="20"/>
     </w:rPr>
   </w:style>
   <w:style w:type="paragraph" w:styleId="Heading1">
@@ -3116,7 +1438,7 @@
       <w:b/>
       <w:bCs/>
       <w:color w:val="4F81BD" w:themeColor="accent1"/>
-      <w:sz w:val="23"/>
+      <w:sz w:val="26"/>
       <w:szCs w:val="26"/>
     </w:rPr>
   </w:style>
@@ -3253,7 +1575,6 @@
     <w:rPr>
       <w:rFonts w:asciiTheme="majorHAnsi" w:eastAsiaTheme="majorEastAsia" w:hAnsiTheme="majorHAnsi" w:cstheme="majorBidi"/>
       <w:color w:val="4F81BD" w:themeColor="accent1"/>
-      <w:sz w:val="20"/>
       <w:szCs w:val="20"/>
     </w:rPr>
   </w:style>
@@ -3278,7 +1599,6 @@
       <w:i/>
       <w:iCs/>
       <w:color w:val="404040" w:themeColor="text1" w:themeTint="BF"/>
-      <w:sz w:val="20"/>
       <w:szCs w:val="20"/>
     </w:rPr>
   </w:style>
@@ -3422,11 +1742,10 @@
     </w:pPr>
     <w:rPr>
       <w:rFonts w:asciiTheme="majorHAnsi" w:eastAsiaTheme="majorEastAsia" w:hAnsiTheme="majorHAnsi" w:cstheme="majorBidi"/>
-      <w:b/>
       <w:color w:val="17365D" w:themeColor="text2" w:themeShade="BF"/>
       <w:spacing w:val="5"/>
       <w:kern w:val="28"/>
-      <w:sz w:val="36"/>
+      <w:sz w:val="52"/>
       <w:szCs w:val="52"/>
     </w:rPr>
   </w:style>

</xml_diff>